<commit_message>
Correções na cartela de 15/10 (seis dias; placar do Conselho do MPF; dosimetria)
Co-Authored-By: Claude Opus 5.5 <noreply@anthropic.com>
Claude-Session: https://claude.ai/code/session_01EGrxw11y1RieUGZ6R9XQan
</commit_message>
<xml_diff>
--- a/roteiros/curtos/ROTEIROS_15102026.docx
+++ b/roteiros/curtos/ROTEIROS_15102026.docx
@@ -301,7 +301,7 @@
           <w:sz w:val="24"/>
           <w:szCs w:val="24"/>
         </w:rPr>
-        <w:t xml:space="preserve">Importante: o relatório não diz que eles fizeram alguma coisa a pedido do Vorcaro. O Moraes nega ter recebido essas mensagens, o Vorcaro nega a autenticidade, e ninguém foi acusado por isso. Mas, quando pediram o afastamento do Gonet do caso Master, o Conselho Superior do Ministério Público Federal manteve ele por 5 a 4. Placar apertado.</w:t>
+        <w:t xml:space="preserve">Importante: o relatório não diz que eles fizeram alguma coisa a pedido do Vorcaro. O Moraes nega ter recebido essas mensagens, o Vorcaro nega a autenticidade, e ninguém foi acusado por isso. E o Conselho Superior do Ministério Público Federal rejeitou abrir investigação contra o Gonet por 5 a 4. Placar apertado.</w:t>
       </w:r>
     </w:p>
     <w:p>
@@ -342,7 +342,7 @@
           <w:sz w:val="16"/>
           <w:szCs w:val="16"/>
         </w:rPr>
-        <w:t xml:space="preserve">Fatos (Poder360, Agência Brasil, Conjur, Congresso em Foco, CNN, Gazeta do Povo, InfoMoney, Brasil de Fato): Mendonça é relator do caso Master desde 12/2/2026. Afastamento em 8/9/2026 na Pet 16.662 (decisão de 33 páginas, a pedido do Partido Novo, que também pediu prisão, negada): Andrei Rodrigues (diretor-geral) e Leandro Almada (diretor de inteligência); decisão diz que o relator foi monitorado por ao menos 6 relatórios de inteligência entre 3 e 31/8; ofício de Andrei de 1/9 enviando os relatórios a Moraes. 2ª Turma: Mendonça, Nunes Marques e Fux referendavam; Gilmar pediu vista. 9/9: Dino reconduziu (Pet 16.669) e Fachin, na SL 1.946 (da União/AGU) e na Pet 16.704, suspendeu as duas decisões e manteve Andrei até o Plenário. PGR (Gonet e o vice Hildebrando Chateaubriand) deu parecer na SL 1.946 (enviado na noite de 13/10) pela procedência da suspensão: 'não há ato concreto de Andrei ou de Almada que justifique o afastamento' (paráfrase da imprensa; CONFERIR aspas), ilegitimidade do partido, nomeação privativa do Presidente. NÃO chamar de 'recurso da PGR'. Andrei disse a Fachin (13/10) que enviou os relatórios por ordem de Moraes e que a PF não monitorou Mendonça. Lei 9.266/1996, art. 2º-C (nomeação pelo Presidente); CPP, art. 319, VI (suspensão do exercício de função pública; o vídeo cita como regra geral, NÃO como fundamento expresso da decisão, que não foi confirmado). Mensagem de 15/11/2025 (relatório da PF, sigilo retirado em 1/9/2026): as fontes divergem na redação ('com Paulo e Andrei', CNN; 'com o Paulo ou Andrei?', Correio da Manhã/SBT), por isso o vídeo não usa aspas da frase inteira; a PF diz que os nomes 'podem indicar' Gonet e Andrei; o relatório não aponta que Moraes, Gonet ou Andrei tenham atuado; Moraes não é investigado; as respostas de Moraes não foram recuperadas (mensagens de visualização única). STF (6/3/2026, a pedido de Moraes) disse que mensagens atribuídas a ele não foram enviadas ao ministro; Vorcaro nega autenticidade. Conselho Superior do MPF (25/9/2026) rejeitou afastar Gonet do caso Master e arquivou apuração por 5 x 4. Não citar a viagem a Londres do filho de Gonet (não há prova de pagamento; a defesa do filho nega). NÃO citar Dark Horse nem as emendas do filme (aparecem na decisão de Dino): tiro no pé. Se comentarem sobre Flávio e Vorcaro: não responder no vídeo; o tema é a PF e a PGR. Prazo do afastamento (90 dias) não confirmado: não citar. Publicar no perfil pessoal, sem impulsionar; nada novo em 25/10.</w:t>
+        <w:t xml:space="preserve">Fatos (Poder360, Agência Brasil, Conjur, Congresso em Foco, CNN, Gazeta do Povo, InfoMoney, Brasil de Fato): Mendonça é relator do caso Master desde 12/2/2026. Afastamento em 8/9/2026 na Pet 16.662 (decisão de 33 páginas, a pedido do Partido Novo, que também pediu prisão, negada): Andrei Rodrigues (diretor-geral) e Leandro Almada (diretor de inteligência); decisão diz que o relator foi monitorado por ao menos 6 relatórios de inteligência entre 3 e 31/8; ofício de Andrei de 1/9 enviando os relatórios a Moraes. 2ª Turma: Mendonça, Nunes Marques e Fux referendavam; Gilmar pediu vista. 9/9: Dino reconduziu (Pet 16.669) e Fachin, na SL 1.946 (da União/AGU) e na Pet 16.704, suspendeu as duas decisões e manteve Andrei até o Plenário. PGR (Gonet e o vice Hildebrando Chateaubriand) deu parecer na SL 1.946 (enviado na noite de 13/10) pela procedência da suspensão: 'não há ato concreto de Andrei ou de Almada que justifique o afastamento' (paráfrase da imprensa; CONFERIR aspas), ilegitimidade do partido, nomeação privativa do Presidente. NÃO chamar de 'recurso da PGR'. Andrei disse a Fachin (13/10) que enviou os relatórios por ordem de Moraes e que a PF não monitorou Mendonça. Lei 9.266/1996, art. 2º-C (nomeação pelo Presidente); CPP, art. 319, VI (suspensão do exercício de função pública; o vídeo cita como regra geral, NÃO como fundamento expresso da decisão, que não foi confirmado). Mensagem de 15/11/2025 (relatório da PF, sigilo retirado em 1/9/2026): as fontes divergem na redação ('com Paulo e Andrei', CNN; 'com o Paulo ou Andrei?', Correio da Manhã/SBT), por isso o vídeo não usa aspas da frase inteira; a PF diz que os nomes 'podem indicar' Gonet e Andrei; o relatório não aponta que Moraes, Gonet ou Andrei tenham atuado; Moraes não é investigado; as respostas de Moraes não foram recuperadas (mensagens de visualização única). STF (6/3/2026, a pedido de Moraes) disse que mensagens atribuídas a ele não foram enviadas ao ministro; Vorcaro nega autenticidade. Conselho Superior do MPF (25/9/2026): por unanimidade, sem competência para decidir a suspeição/afastamento; por 5 x 4, rejeitou abrir investigação contra Gonet (comunicado oficial do MPF). CORRIGIDO em 15/10. Não citar a viagem a Londres do filho de Gonet (não há prova de pagamento; a defesa do filho nega). NÃO citar Dark Horse nem as emendas do filme (aparecem na decisão de Dino): tiro no pé. Se comentarem sobre Flávio e Vorcaro: não responder no vídeo; o tema é a PF e a PGR. Prazo do afastamento (90 dias) não confirmado: não citar. Publicar no perfil pessoal, sem impulsionar; nada novo em 25/10.</w:t>
       </w:r>
     </w:p>
     <w:p>
@@ -375,21 +375,21 @@
           <w:sz w:val="28"/>
           <w:szCs w:val="28"/>
         </w:rPr>
-        <w:t xml:space="preserve">ROTEIRO 3 — PAES DISSE QUE RESPEITAVA A DECISÃO. CINCO DIAS DEPOIS, O PARTIDO DELE FOI AO STF PEDIR SEGUNDO TURNO NO RIO</w:t>
-      </w:r>
-    </w:p>
-    <w:p>
-      <w:pPr>
-        <w:spacing w:after="120"/>
-        <w:jc w:val="both"/>
-      </w:pPr>
-      <w:r>
-        <w:rPr>
-          <w:rFonts w:ascii="Times New Roman" w:cs="Times New Roman" w:eastAsia="Times New Roman" w:hAnsi="Times New Roman"/>
-          <w:sz w:val="24"/>
-          <w:szCs w:val="24"/>
-        </w:rPr>
-        <w:t xml:space="preserve">No dia 8 de outubro, o Eduardo Paes disse: “a eleição termina” e “decisão judicial a gente respeita”. Cinco dias depois, o partido dele, o PSD, foi ao Supremo pedir um segundo turno no Rio. Pode isso? E tem chance? Vamos pra lei.</w:t>
+        <w:t xml:space="preserve">ROTEIRO 3 — PAES DISSE QUE RESPEITAVA A DECISÃO. SEIS DIAS DEPOIS, O PARTIDO DELE FOI AO STF PEDIR SEGUNDO TURNO NO RIO</w:t>
+      </w:r>
+    </w:p>
+    <w:p>
+      <w:pPr>
+        <w:spacing w:after="120"/>
+        <w:jc w:val="both"/>
+      </w:pPr>
+      <w:r>
+        <w:rPr>
+          <w:rFonts w:ascii="Times New Roman" w:cs="Times New Roman" w:eastAsia="Times New Roman" w:hAnsi="Times New Roman"/>
+          <w:sz w:val="24"/>
+          <w:szCs w:val="24"/>
+        </w:rPr>
+        <w:t xml:space="preserve">No dia 8 de outubro, o Eduardo Paes disse: “a eleição termina” e “decisão judicial a gente respeita”. Seis dias depois, o partido dele, o PSD, foi ao Supremo pedir um segundo turno no Rio. Pode isso? E tem chance? Vamos pra lei.</w:t>
       </w:r>
     </w:p>
     <w:p>

</xml_diff>